<commit_message>
Sync resume with latest DOCX; add SLI/SLO/SLA coverage across site
Update resume.md to match source: Welltok retitled to SRE, expanded Smartly summary, Centene migrate bullet + Runbooks, new TalentReef SLI bullet, Welltok SLI/SLO/SLA creation.

Experience page: add SLI/SLO/SLA bullet to TalentReef and a new Welltok card (section now Recent Experience 2016-2024) so SLO work is backed by its role.

Downloads: refresh public DOCX from source, regenerate stephen-abbot-resume.pdf via LibreOffice, remove stale 'Stephen Abbot Resume January.pdf', update resume.astro link.

Also add Claude Personal blog post and work case study; gitignore z_ scratch files.

Co-Authored-By: Claude Opus 4.8 <noreply@anthropic.com>
</commit_message>
<xml_diff>
--- a/public/stephen-abbot-resume.docx
+++ b/public/stephen-abbot-resume.docx
@@ -50,14 +50,12 @@
         </w:tabs>
         <w:rPr/>
       </w:pPr>
-      <w:hyperlink r:id="rId2">
-        <w:r>
-          <w:rPr>
-            <w:rStyle w:val="Hyperlink"/>
-          </w:rPr>
-          <w:t>stephen.abbot@denverbytes.com</w:t>
-        </w:r>
-      </w:hyperlink>
+      <w:r>
+        <w:rPr>
+          <w:rStyle w:val="Hyperlink"/>
+        </w:rPr>
+        <w:t>stephen.abbot@denverbytes.com</w:t>
+      </w:r>
     </w:p>
     <w:p>
       <w:pPr>
@@ -68,7 +66,7 @@
         </w:tabs>
         <w:rPr/>
       </w:pPr>
-      <w:hyperlink r:id="rId3">
+      <w:hyperlink r:id="rId2">
         <w:r>
           <w:rPr>
             <w:rStyle w:val="Hyperlink"/>
@@ -86,7 +84,7 @@
         </w:tabs>
         <w:rPr/>
       </w:pPr>
-      <w:hyperlink r:id="rId4">
+      <w:hyperlink r:id="rId3">
         <w:r>
           <w:rPr>
             <w:rStyle w:val="Hyperlink"/>
@@ -107,7 +105,7 @@
           <w:bCs/>
         </w:rPr>
       </w:pPr>
-      <w:hyperlink r:id="rId5">
+      <w:hyperlink r:id="rId4">
         <w:r>
           <w:rPr>
             <w:rStyle w:val="Hyperlink"/>
@@ -376,12 +374,262 @@
           <w:b/>
           <w:bCs/>
         </w:rPr>
-        <w:t>Migrate Alarm PoC Automated Alarming Application to MVP</w:t>
+        <w:t xml:space="preserve">Migrate </w:t>
+      </w:r>
+      <w:r>
+        <w:rPr>
+          <w:b/>
+          <w:bCs/>
+        </w:rPr>
+        <w:t xml:space="preserve">automated </w:t>
+      </w:r>
+      <w:r>
+        <w:rPr>
+          <w:b/>
+          <w:bCs/>
+        </w:rPr>
+        <w:t xml:space="preserve">Alarm PoC </w:t>
+      </w:r>
+      <w:r>
+        <w:rPr>
+          <w:b/>
+          <w:bCs/>
+        </w:rPr>
+        <w:t>to Production with support</w:t>
       </w:r>
       <w:r>
         <w:rPr/>
         <w:t>: Work with fellow team members to migrate PoC application to Terraform application supporting standard and custom alarming solutions for Customers to use to manage their AWS CloudWatch alarming needs</w:t>
       </w:r>
+    </w:p>
+    <w:p>
+      <w:pPr>
+        <w:pStyle w:val="Normal"/>
+        <w:spacing w:before="280" w:after="160"/>
+        <w:rPr/>
+      </w:pPr>
+      <w:r>
+        <w:rPr/>
+        <w:t xml:space="preserve">• </w:t>
+      </w:r>
+      <w:r>
+        <w:rPr>
+          <w:b/>
+          <w:bCs/>
+        </w:rPr>
+        <w:t xml:space="preserve">Runbooks </w:t>
+      </w:r>
+      <w:r>
+        <w:rPr>
+          <w:b/>
+          <w:bCs/>
+        </w:rPr>
+        <w:t>&amp;</w:t>
+      </w:r>
+      <w:r>
+        <w:rPr>
+          <w:b/>
+          <w:bCs/>
+        </w:rPr>
+        <w:t xml:space="preserve"> Playbooks </w:t>
+      </w:r>
+      <w:r>
+        <w:rPr/>
+        <w:t xml:space="preserve">:  </w:t>
+      </w:r>
+      <w:r>
+        <w:rPr/>
+        <w:t xml:space="preserve">Create </w:t>
+      </w:r>
+      <w:r>
+        <w:rPr/>
+        <w:t xml:space="preserve">runbooks </w:t>
+      </w:r>
+      <w:r>
+        <w:rPr/>
+        <w:t xml:space="preserve">and </w:t>
+      </w:r>
+      <w:r>
+        <w:rPr/>
+        <w:t xml:space="preserve">playbooks </w:t>
+      </w:r>
+      <w:r>
+        <w:rPr/>
+        <w:t>as needed</w:t>
+      </w:r>
+    </w:p>
+    <w:p>
+      <w:pPr>
+        <w:pStyle w:val="Normal"/>
+        <w:spacing w:before="280" w:after="160"/>
+        <w:rPr>
+          <w:b/>
+          <w:bCs/>
+          <w:u w:val="single"/>
+        </w:rPr>
+      </w:pPr>
+      <w:r>
+        <w:rPr>
+          <w:b/>
+          <w:bCs/>
+          <w:u w:val="single"/>
+        </w:rPr>
+        <w:t>Sr. Site Reliability Engineer - Centene (Contractor via Zeektek) | Remote | Dec 2023 - Aug 2024</w:t>
+      </w:r>
+    </w:p>
+    <w:p>
+      <w:pPr>
+        <w:pStyle w:val="Normal"/>
+        <w:suppressLineNumbers w:val="0"/>
+        <w:bidi w:val="0"/>
+        <w:spacing w:lineRule="auto" w:line="259" w:before="280" w:after="160"/>
+        <w:ind w:start="0" w:end="0"/>
+        <w:jc w:val="start"/>
+        <w:rPr/>
+      </w:pPr>
+      <w:r>
+        <w:rPr/>
+        <w:t>Enabled consistent deployment of AWS Recommended and custom alarms to support reliable, actionable monitoring across environments. Standardized alerting made it easier for teams to detect issues early, reduce configuration drift, and maintain consistent cross team scalable monitoring practices.</w:t>
+      </w:r>
+    </w:p>
+    <w:p>
+      <w:pPr>
+        <w:pStyle w:val="Normal"/>
+        <w:suppressLineNumbers w:val="0"/>
+        <w:bidi w:val="0"/>
+        <w:spacing w:lineRule="auto" w:line="259" w:before="280" w:after="160"/>
+        <w:ind w:start="0" w:end="0"/>
+        <w:jc w:val="start"/>
+        <w:rPr/>
+      </w:pPr>
+      <w:r>
+        <w:rPr/>
+        <w:t xml:space="preserve">• </w:t>
+      </w:r>
+      <w:r>
+        <w:rPr>
+          <w:b/>
+          <w:bCs/>
+        </w:rPr>
+        <w:t>Hierarchical Alarm Customization</w:t>
+      </w:r>
+      <w:r>
+        <w:rPr/>
+        <w:t>: Designed an intuitive, CSV-based hierarchical configuration supporting team, environment, resource-type, and resource-specific alarm overrides, enabling flexible and precise alarm management</w:t>
+      </w:r>
+    </w:p>
+    <w:p>
+      <w:pPr>
+        <w:pStyle w:val="Normal"/>
+        <w:suppressLineNumbers w:val="0"/>
+        <w:bidi w:val="0"/>
+        <w:spacing w:lineRule="auto" w:line="259" w:before="280" w:after="160"/>
+        <w:ind w:start="0" w:end="0"/>
+        <w:jc w:val="start"/>
+        <w:rPr/>
+      </w:pPr>
+      <w:r>
+        <w:rPr/>
+        <w:t xml:space="preserve">• </w:t>
+      </w:r>
+      <w:r>
+        <w:rPr>
+          <w:b/>
+          <w:bCs/>
+        </w:rPr>
+        <w:t>Modular Core Architecture</w:t>
+      </w:r>
+      <w:r>
+        <w:rPr/>
+        <w:t>: Developed a modular solution separating the core alarming engine (managed centrally via GitLab) from customer-specific configurations (via forked repositories), promoting standardization and simplifying maintenance while enabling team-specific customization without disrupting shared tooling</w:t>
+      </w:r>
+    </w:p>
+    <w:p>
+      <w:pPr>
+        <w:pStyle w:val="Normal"/>
+        <w:suppressLineNumbers w:val="0"/>
+        <w:bidi w:val="0"/>
+        <w:spacing w:lineRule="auto" w:line="259" w:before="280" w:after="160"/>
+        <w:ind w:start="0" w:end="0"/>
+        <w:jc w:val="start"/>
+        <w:rPr/>
+      </w:pPr>
+      <w:r>
+        <w:rPr/>
+        <w:t xml:space="preserve">• </w:t>
+      </w:r>
+      <w:r>
+        <w:rPr>
+          <w:b/>
+          <w:bCs/>
+        </w:rPr>
+        <w:t>Automated CloudFormation Management</w:t>
+      </w:r>
+      <w:r>
+        <w:rPr/>
+        <w:t>: Built automated deployment pipelines leveraging AWS CloudFormation to manage stack drift, deploy alarms automatically upon resource discovery, and systematically remove orphaned alarms</w:t>
+      </w:r>
+    </w:p>
+    <w:p>
+      <w:pPr>
+        <w:pStyle w:val="Normal"/>
+        <w:suppressLineNumbers w:val="0"/>
+        <w:bidi w:val="0"/>
+        <w:spacing w:lineRule="auto" w:line="259" w:before="280" w:after="160"/>
+        <w:ind w:start="0" w:end="0"/>
+        <w:jc w:val="start"/>
+        <w:rPr/>
+      </w:pPr>
+      <w:r>
+        <w:rPr/>
+        <w:t xml:space="preserve">• </w:t>
+      </w:r>
+      <w:r>
+        <w:rPr>
+          <w:b/>
+          <w:bCs/>
+        </w:rPr>
+        <w:t>Minimal-Footprint Automation</w:t>
+      </w:r>
+      <w:r>
+        <w:rPr/>
+        <w:t>: Engineered automated resource discovery and alarm deployment processes with minimal required AWS account permissions, enhancing security and governance</w:t>
+      </w:r>
+    </w:p>
+    <w:p>
+      <w:pPr>
+        <w:pStyle w:val="Normal"/>
+        <w:suppressLineNumbers w:val="0"/>
+        <w:bidi w:val="0"/>
+        <w:spacing w:lineRule="auto" w:line="259" w:before="280" w:after="160"/>
+        <w:ind w:start="0" w:end="0"/>
+        <w:jc w:val="start"/>
+        <w:rPr/>
+      </w:pPr>
+      <w:r>
+        <w:rPr/>
+        <w:t xml:space="preserve">• </w:t>
+      </w:r>
+      <w:r>
+        <w:rPr>
+          <w:b/>
+          <w:bCs/>
+        </w:rPr>
+        <w:t>Enterprise Integration and Transition</w:t>
+      </w:r>
+      <w:r>
+        <w:rPr/>
+        <w:t>: Piloted and production-validated alarm solution with three independent engineering teams, enabling enterprise-wide transition to standardized IaC workflows and governance-aligned alerting practices</w:t>
+      </w:r>
+    </w:p>
+    <w:p>
+      <w:pPr>
+        <w:pStyle w:val="Normal"/>
+        <w:rPr/>
+      </w:pPr>
+      <w:r>
+        <w:rPr/>
+      </w:r>
       <w:r>
         <w:br w:type="page"/>
       </w:r>
@@ -389,6 +637,229 @@
     <w:p>
       <w:pPr>
         <w:pStyle w:val="Normal"/>
+        <w:suppressLineNumbers w:val="0"/>
+        <w:bidi w:val="0"/>
+        <w:spacing w:lineRule="auto" w:line="259" w:before="0" w:after="160"/>
+        <w:ind w:start="0" w:end="0"/>
+        <w:jc w:val="start"/>
+        <w:rPr>
+          <w:b/>
+          <w:bCs/>
+          <w:u w:val="single"/>
+        </w:rPr>
+      </w:pPr>
+      <w:r>
+        <w:rPr>
+          <w:b/>
+          <w:bCs/>
+          <w:u w:val="single"/>
+        </w:rPr>
+        <w:t xml:space="preserve">Site Reliability Engineer - </w:t>
+      </w:r>
+      <w:r>
+        <w:rPr>
+          <w:rStyle w:val="t-14"/>
+          <w:b/>
+          <w:bCs/>
+          <w:u w:val="single"/>
+        </w:rPr>
+        <w:t>Smartly |</w:t>
+      </w:r>
+      <w:r>
+        <w:rPr>
+          <w:b/>
+          <w:bCs/>
+          <w:u w:val="single"/>
+        </w:rPr>
+        <w:t xml:space="preserve"> remote | Mar 2022 - Nov 2023</w:t>
+      </w:r>
+    </w:p>
+    <w:p>
+      <w:pPr>
+        <w:pStyle w:val="Normal"/>
+        <w:suppressLineNumbers w:val="0"/>
+        <w:bidi w:val="0"/>
+        <w:spacing w:lineRule="auto" w:line="259" w:before="280" w:after="160"/>
+        <w:ind w:start="0" w:end="0"/>
+        <w:jc w:val="start"/>
+        <w:rPr/>
+      </w:pPr>
+      <w:r>
+        <w:rPr/>
+        <w:t>Provided thought leadership and collaborated closely with AI-focused engineering teams as the AWS subject matter expert, guiding infrastructure modernization and observability improvements to meet enterprise-grade expectations for reliability, performance, and scalability - aligning with AWS Well-Architected principles.</w:t>
+      </w:r>
+    </w:p>
+    <w:p>
+      <w:pPr>
+        <w:pStyle w:val="Normal"/>
+        <w:suppressLineNumbers w:val="0"/>
+        <w:bidi w:val="0"/>
+        <w:spacing w:lineRule="auto" w:line="259" w:before="280" w:after="160"/>
+        <w:ind w:start="0" w:end="0"/>
+        <w:jc w:val="start"/>
+        <w:rPr/>
+      </w:pPr>
+      <w:r>
+        <w:rPr/>
+        <w:t xml:space="preserve">• </w:t>
+      </w:r>
+      <w:r>
+        <w:rPr>
+          <w:b/>
+          <w:bCs/>
+        </w:rPr>
+        <w:t>Containerization and Cloud Migration</w:t>
+      </w:r>
+      <w:r>
+        <w:rPr/>
+        <w:t>: Architected and executed migration from Elastic Beanstalk to a container-based microservices architecture leveraging Lambda, ECS, EKS, reducing cost, improving system scalability, flexibility, and reducing operational maintenance effort</w:t>
+      </w:r>
+    </w:p>
+    <w:p>
+      <w:pPr>
+        <w:pStyle w:val="Normal"/>
+        <w:suppressLineNumbers w:val="0"/>
+        <w:bidi w:val="0"/>
+        <w:spacing w:lineRule="auto" w:line="259" w:before="280" w:after="160"/>
+        <w:ind w:start="0" w:end="0"/>
+        <w:jc w:val="start"/>
+        <w:rPr/>
+      </w:pPr>
+      <w:r>
+        <w:rPr/>
+        <w:t xml:space="preserve">• </w:t>
+      </w:r>
+      <w:r>
+        <w:rPr>
+          <w:b/>
+          <w:bCs/>
+        </w:rPr>
+        <w:t>Database Performance Optimization</w:t>
+      </w:r>
+      <w:r>
+        <w:rPr/>
+        <w:t>: Identified critical PostgreSQL performance bottlenecks through detailed analysis, facilitating a strategic migration to Amazon Aurora for enhanced scalability and reliability</w:t>
+      </w:r>
+    </w:p>
+    <w:p>
+      <w:pPr>
+        <w:pStyle w:val="Normal"/>
+        <w:suppressLineNumbers w:val="0"/>
+        <w:bidi w:val="0"/>
+        <w:spacing w:lineRule="auto" w:line="259" w:before="280" w:after="160"/>
+        <w:ind w:start="0" w:end="0"/>
+        <w:jc w:val="start"/>
+        <w:rPr/>
+      </w:pPr>
+      <w:r>
+        <w:rPr/>
+        <w:t xml:space="preserve">• </w:t>
+      </w:r>
+      <w:r>
+        <w:rPr>
+          <w:b/>
+          <w:bCs/>
+        </w:rPr>
+        <w:t>Global Delivery Enhancement</w:t>
+      </w:r>
+      <w:r>
+        <w:rPr/>
+        <w:t>: Improved global application performance and security posture by integrating CloudFront CDN and AWS API Gateway, reducing latency and enhancing user experience</w:t>
+      </w:r>
+    </w:p>
+    <w:p>
+      <w:pPr>
+        <w:pStyle w:val="Normal"/>
+        <w:suppressLineNumbers w:val="0"/>
+        <w:bidi w:val="0"/>
+        <w:spacing w:lineRule="auto" w:line="259" w:before="280" w:after="160"/>
+        <w:ind w:start="0" w:end="0"/>
+        <w:jc w:val="start"/>
+        <w:rPr/>
+      </w:pPr>
+      <w:r>
+        <w:rPr/>
+        <w:t xml:space="preserve">• </w:t>
+      </w:r>
+      <w:r>
+        <w:rPr>
+          <w:b/>
+          <w:bCs/>
+        </w:rPr>
+        <w:t>Comprehensive Observability Implementation</w:t>
+      </w:r>
+      <w:r>
+        <w:rPr/>
+        <w:t>: Built a robust observability framework using CloudWatch (RUM, Metrics, Logs) with Open Telemetry, enabling data-driven, cross-stack performance optimizations and distributed tracing</w:t>
+      </w:r>
+    </w:p>
+    <w:p>
+      <w:pPr>
+        <w:pStyle w:val="Normal"/>
+        <w:suppressLineNumbers w:val="0"/>
+        <w:bidi w:val="0"/>
+        <w:spacing w:lineRule="auto" w:line="259" w:before="280" w:after="160"/>
+        <w:ind w:start="0" w:end="0"/>
+        <w:jc w:val="start"/>
+        <w:rPr/>
+      </w:pPr>
+      <w:r>
+        <w:rPr/>
+        <w:t xml:space="preserve">• </w:t>
+      </w:r>
+      <w:r>
+        <w:rPr>
+          <w:b/>
+          <w:bCs/>
+        </w:rPr>
+        <w:t>Proactive Monitoring and Alerting</w:t>
+      </w:r>
+      <w:r>
+        <w:rPr/>
+        <w:t>: Developed automated alerting mechanisms using AWS CloudWatch and SNS, providing real-time incident detection and notification workflows that improved response speed and on-call visibility</w:t>
+      </w:r>
+    </w:p>
+    <w:p>
+      <w:pPr>
+        <w:pStyle w:val="Normal"/>
+        <w:suppressLineNumbers w:val="0"/>
+        <w:bidi w:val="0"/>
+        <w:spacing w:lineRule="auto" w:line="259" w:before="280" w:after="160"/>
+        <w:ind w:start="0" w:end="0"/>
+        <w:jc w:val="start"/>
+        <w:rPr/>
+      </w:pPr>
+      <w:r>
+        <w:rPr/>
+        <w:t xml:space="preserve">• </w:t>
+      </w:r>
+      <w:r>
+        <w:rPr>
+          <w:b/>
+          <w:bCs/>
+        </w:rPr>
+        <w:t>Team Mentorship and Best Practices</w:t>
+      </w:r>
+      <w:r>
+        <w:rPr/>
+        <w:t>: Mentored junior developers and peers in AWS best practices across critical technologies including RDS, EKS, Lambda, and secure VPC configurations, fostering skill development and team alignment</w:t>
+      </w:r>
+    </w:p>
+    <w:p>
+      <w:pPr>
+        <w:pStyle w:val="Normal"/>
+        <w:rPr/>
+      </w:pPr>
+      <w:r>
+        <w:rPr/>
+      </w:r>
+      <w:r>
+        <w:br w:type="page"/>
+      </w:r>
+    </w:p>
+    <w:p>
+      <w:pPr>
+        <w:pStyle w:val="Normal"/>
         <w:spacing w:before="0" w:after="0"/>
         <w:rPr>
           <w:b/>
@@ -398,405 +869,6 @@
       </w:pPr>
       <w:r>
         <w:rPr>
-          <w:b/>
-          <w:bCs/>
-          <w:u w:val="single"/>
-        </w:rPr>
-        <w:t>Sr. Site Reliability Engineer - Centene (Contractor via Zeektek) | Remote | Dec 2023 - Aug 2024</w:t>
-      </w:r>
-    </w:p>
-    <w:p>
-      <w:pPr>
-        <w:pStyle w:val="Normal"/>
-        <w:suppressLineNumbers w:val="0"/>
-        <w:bidi w:val="0"/>
-        <w:spacing w:lineRule="auto" w:line="259" w:before="280" w:after="160"/>
-        <w:ind w:start="0" w:end="0"/>
-        <w:jc w:val="start"/>
-        <w:rPr/>
-      </w:pPr>
-      <w:r>
-        <w:rPr/>
-        <w:t>Enabled consistent deployment of AWS Recommended and custom alarms to support reliable, actionable monitoring across environments. Standardized alerting made it easier for teams to detect issues early, reduce configuration drift, and maintain consistent cross team scalable monitoring practices.</w:t>
-      </w:r>
-    </w:p>
-    <w:p>
-      <w:pPr>
-        <w:pStyle w:val="Normal"/>
-        <w:suppressLineNumbers w:val="0"/>
-        <w:bidi w:val="0"/>
-        <w:spacing w:lineRule="auto" w:line="259" w:before="280" w:after="160"/>
-        <w:ind w:start="0" w:end="0"/>
-        <w:jc w:val="start"/>
-        <w:rPr/>
-      </w:pPr>
-      <w:r>
-        <w:rPr/>
-        <w:t xml:space="preserve">• </w:t>
-      </w:r>
-      <w:r>
-        <w:rPr>
-          <w:b/>
-          <w:bCs/>
-        </w:rPr>
-        <w:t>Hierarchical Alarm Customization</w:t>
-      </w:r>
-      <w:r>
-        <w:rPr/>
-        <w:t>: Designed an intuitive, CSV-based hierarchical configuration supporting team, environment, resource-type, and resource-specific alarm overrides, enabling flexible and precise alarm management</w:t>
-      </w:r>
-    </w:p>
-    <w:p>
-      <w:pPr>
-        <w:pStyle w:val="Normal"/>
-        <w:suppressLineNumbers w:val="0"/>
-        <w:bidi w:val="0"/>
-        <w:spacing w:lineRule="auto" w:line="259" w:before="280" w:after="160"/>
-        <w:ind w:start="0" w:end="0"/>
-        <w:jc w:val="start"/>
-        <w:rPr/>
-      </w:pPr>
-      <w:r>
-        <w:rPr/>
-        <w:t xml:space="preserve">• </w:t>
-      </w:r>
-      <w:r>
-        <w:rPr>
-          <w:b/>
-          <w:bCs/>
-        </w:rPr>
-        <w:t>Modular Core Architecture</w:t>
-      </w:r>
-      <w:r>
-        <w:rPr/>
-        <w:t>: Developed a modular solution separating the core alarming engine (managed centrally via GitLab) from customer-specific configurations (via forked repositories), promoting standardization and simplifying maintenance while enabling team-specific customization without disrupting shared tooling</w:t>
-      </w:r>
-    </w:p>
-    <w:p>
-      <w:pPr>
-        <w:pStyle w:val="Normal"/>
-        <w:suppressLineNumbers w:val="0"/>
-        <w:bidi w:val="0"/>
-        <w:spacing w:lineRule="auto" w:line="259" w:before="280" w:after="160"/>
-        <w:ind w:start="0" w:end="0"/>
-        <w:jc w:val="start"/>
-        <w:rPr/>
-      </w:pPr>
-      <w:r>
-        <w:rPr/>
-        <w:t xml:space="preserve">• </w:t>
-      </w:r>
-      <w:r>
-        <w:rPr>
-          <w:b/>
-          <w:bCs/>
-        </w:rPr>
-        <w:t>Automated CloudFormation Management</w:t>
-      </w:r>
-      <w:r>
-        <w:rPr/>
-        <w:t>: Built automated deployment pipelines leveraging AWS CloudFormation to manage stack drift, deploy alarms automatically upon resource discovery, and systematically remove orphaned alarms</w:t>
-      </w:r>
-    </w:p>
-    <w:p>
-      <w:pPr>
-        <w:pStyle w:val="Normal"/>
-        <w:suppressLineNumbers w:val="0"/>
-        <w:bidi w:val="0"/>
-        <w:spacing w:lineRule="auto" w:line="259" w:before="280" w:after="160"/>
-        <w:ind w:start="0" w:end="0"/>
-        <w:jc w:val="start"/>
-        <w:rPr/>
-      </w:pPr>
-      <w:r>
-        <w:rPr/>
-        <w:t xml:space="preserve">• </w:t>
-      </w:r>
-      <w:r>
-        <w:rPr>
-          <w:b/>
-          <w:bCs/>
-        </w:rPr>
-        <w:t>Minimal-Footprint Automation</w:t>
-      </w:r>
-      <w:r>
-        <w:rPr/>
-        <w:t>: Engineered automated resource discovery and alarm deployment processes with minimal required AWS account permissions, enhancing security and governance</w:t>
-      </w:r>
-    </w:p>
-    <w:p>
-      <w:pPr>
-        <w:pStyle w:val="Normal"/>
-        <w:suppressLineNumbers w:val="0"/>
-        <w:bidi w:val="0"/>
-        <w:spacing w:lineRule="auto" w:line="259" w:before="280" w:after="160"/>
-        <w:ind w:start="0" w:end="0"/>
-        <w:jc w:val="start"/>
-        <w:rPr/>
-      </w:pPr>
-      <w:r>
-        <w:rPr/>
-        <w:t xml:space="preserve">• </w:t>
-      </w:r>
-      <w:r>
-        <w:rPr>
-          <w:b/>
-          <w:bCs/>
-        </w:rPr>
-        <w:t>Enterprise Integration and Transition</w:t>
-      </w:r>
-      <w:r>
-        <w:rPr/>
-        <w:t>: Piloted and production-validated alarm solution with three independent engineering teams, enabling enterprise-wide transition to standardized IaC workflows and governance-aligned alerting practices</w:t>
-      </w:r>
-    </w:p>
-    <w:p>
-      <w:pPr>
-        <w:pStyle w:val="Normal"/>
-        <w:rPr/>
-      </w:pPr>
-      <w:r>
-        <w:rPr/>
-      </w:r>
-      <w:r>
-        <w:br w:type="page"/>
-      </w:r>
-    </w:p>
-    <w:p>
-      <w:pPr>
-        <w:pStyle w:val="Normal"/>
-        <w:suppressLineNumbers w:val="0"/>
-        <w:bidi w:val="0"/>
-        <w:spacing w:lineRule="auto" w:line="259" w:before="0" w:after="160"/>
-        <w:ind w:start="0" w:end="0"/>
-        <w:jc w:val="start"/>
-        <w:rPr>
-          <w:b/>
-          <w:bCs/>
-          <w:u w:val="single"/>
-        </w:rPr>
-      </w:pPr>
-      <w:r>
-        <w:rPr>
-          <w:b/>
-          <w:bCs/>
-          <w:u w:val="single"/>
-        </w:rPr>
-        <w:t xml:space="preserve">Site Reliability Engineer - </w:t>
-      </w:r>
-      <w:r>
-        <w:rPr>
-          <w:rStyle w:val="t-14"/>
-          <w:b/>
-          <w:bCs/>
-          <w:u w:val="single"/>
-        </w:rPr>
-        <w:t>Smartly |</w:t>
-      </w:r>
-      <w:r>
-        <w:rPr>
-          <w:b/>
-          <w:bCs/>
-          <w:u w:val="single"/>
-        </w:rPr>
-        <w:t xml:space="preserve"> remote | Mar 2022 - Nov 2023</w:t>
-      </w:r>
-    </w:p>
-    <w:p>
-      <w:pPr>
-        <w:pStyle w:val="Normal"/>
-        <w:suppressLineNumbers w:val="0"/>
-        <w:bidi w:val="0"/>
-        <w:spacing w:lineRule="auto" w:line="259" w:before="280" w:after="160"/>
-        <w:ind w:start="0" w:end="0"/>
-        <w:jc w:val="start"/>
-        <w:rPr/>
-      </w:pPr>
-      <w:r>
-        <w:rPr/>
-        <w:t>Provided thought leadership and collaborated closely with AI-focused engineering teams as the AWS subject matter expert, guiding infrastructure modernization and observability improvements to meet enterprise-grade expectations for reliability, performance, and scalability - aligning with AWS Well-Architected principles.</w:t>
-      </w:r>
-    </w:p>
-    <w:p>
-      <w:pPr>
-        <w:pStyle w:val="Normal"/>
-        <w:suppressLineNumbers w:val="0"/>
-        <w:bidi w:val="0"/>
-        <w:spacing w:lineRule="auto" w:line="259" w:before="280" w:after="160"/>
-        <w:ind w:start="0" w:end="0"/>
-        <w:jc w:val="start"/>
-        <w:rPr/>
-      </w:pPr>
-      <w:r>
-        <w:rPr/>
-        <w:t xml:space="preserve">• </w:t>
-      </w:r>
-      <w:r>
-        <w:rPr>
-          <w:b/>
-          <w:bCs/>
-        </w:rPr>
-        <w:t>Containerization and Cloud Migration</w:t>
-      </w:r>
-      <w:r>
-        <w:rPr/>
-        <w:t>: Architected and executed migration from Elastic Beanstalk to a container-based microservices architecture leveraging Lambda, ECS, EKS, reducing cost, improving system scalability, flexibility, and reducing operational maintenance effort</w:t>
-      </w:r>
-    </w:p>
-    <w:p>
-      <w:pPr>
-        <w:pStyle w:val="Normal"/>
-        <w:suppressLineNumbers w:val="0"/>
-        <w:bidi w:val="0"/>
-        <w:spacing w:lineRule="auto" w:line="259" w:before="280" w:after="160"/>
-        <w:ind w:start="0" w:end="0"/>
-        <w:jc w:val="start"/>
-        <w:rPr/>
-      </w:pPr>
-      <w:r>
-        <w:rPr/>
-        <w:t xml:space="preserve">• </w:t>
-      </w:r>
-      <w:r>
-        <w:rPr>
-          <w:b/>
-          <w:bCs/>
-        </w:rPr>
-        <w:t>Database Performance Optimization</w:t>
-      </w:r>
-      <w:r>
-        <w:rPr/>
-        <w:t>: Identified critical PostgreSQL performance bottlenecks through detailed analysis, facilitating a strategic migration to Amazon Aurora for enhanced scalability and reliability</w:t>
-      </w:r>
-    </w:p>
-    <w:p>
-      <w:pPr>
-        <w:pStyle w:val="Normal"/>
-        <w:suppressLineNumbers w:val="0"/>
-        <w:bidi w:val="0"/>
-        <w:spacing w:lineRule="auto" w:line="259" w:before="280" w:after="160"/>
-        <w:ind w:start="0" w:end="0"/>
-        <w:jc w:val="start"/>
-        <w:rPr/>
-      </w:pPr>
-      <w:r>
-        <w:rPr/>
-        <w:t xml:space="preserve">• </w:t>
-      </w:r>
-      <w:r>
-        <w:rPr>
-          <w:b/>
-          <w:bCs/>
-        </w:rPr>
-        <w:t>Global Delivery Enhancement</w:t>
-      </w:r>
-      <w:r>
-        <w:rPr/>
-        <w:t>: Improved global application performance and security posture by integrating CloudFront CDN and AWS API Gateway, reducing latency and enhancing user experience</w:t>
-      </w:r>
-    </w:p>
-    <w:p>
-      <w:pPr>
-        <w:pStyle w:val="Normal"/>
-        <w:suppressLineNumbers w:val="0"/>
-        <w:bidi w:val="0"/>
-        <w:spacing w:lineRule="auto" w:line="259" w:before="280" w:after="160"/>
-        <w:ind w:start="0" w:end="0"/>
-        <w:jc w:val="start"/>
-        <w:rPr/>
-      </w:pPr>
-      <w:r>
-        <w:rPr/>
-        <w:t xml:space="preserve">• </w:t>
-      </w:r>
-      <w:r>
-        <w:rPr>
-          <w:b/>
-          <w:bCs/>
-        </w:rPr>
-        <w:t>Comprehensive Observability Implementation</w:t>
-      </w:r>
-      <w:r>
-        <w:rPr/>
-        <w:t>: Built a robust observability framework using CloudWatch (RUM, Metrics, Logs) with Open Telemetry, enabling data-driven, cross-stack performance optimizations and distributed tracing</w:t>
-      </w:r>
-    </w:p>
-    <w:p>
-      <w:pPr>
-        <w:pStyle w:val="Normal"/>
-        <w:suppressLineNumbers w:val="0"/>
-        <w:bidi w:val="0"/>
-        <w:spacing w:lineRule="auto" w:line="259" w:before="280" w:after="160"/>
-        <w:ind w:start="0" w:end="0"/>
-        <w:jc w:val="start"/>
-        <w:rPr/>
-      </w:pPr>
-      <w:r>
-        <w:rPr/>
-        <w:t xml:space="preserve">• </w:t>
-      </w:r>
-      <w:r>
-        <w:rPr>
-          <w:b/>
-          <w:bCs/>
-        </w:rPr>
-        <w:t>Proactive Monitoring and Alerting</w:t>
-      </w:r>
-      <w:r>
-        <w:rPr/>
-        <w:t>: Developed automated alerting mechanisms using AWS CloudWatch and SNS, providing real-time incident detection and notification workflows that improved response speed and on-call visibility</w:t>
-      </w:r>
-    </w:p>
-    <w:p>
-      <w:pPr>
-        <w:pStyle w:val="Normal"/>
-        <w:suppressLineNumbers w:val="0"/>
-        <w:bidi w:val="0"/>
-        <w:spacing w:lineRule="auto" w:line="259" w:before="280" w:after="160"/>
-        <w:ind w:start="0" w:end="0"/>
-        <w:jc w:val="start"/>
-        <w:rPr/>
-      </w:pPr>
-      <w:r>
-        <w:rPr/>
-        <w:t xml:space="preserve">• </w:t>
-      </w:r>
-      <w:r>
-        <w:rPr>
-          <w:b/>
-          <w:bCs/>
-        </w:rPr>
-        <w:t>Team Mentorship and Best Practices</w:t>
-      </w:r>
-      <w:r>
-        <w:rPr/>
-        <w:t>: Mentored junior developers and peers in AWS best practices across critical technologies including RDS, EKS, Lambda, and secure VPC configurations, fostering skill development and team alignment</w:t>
-      </w:r>
-    </w:p>
-    <w:p>
-      <w:pPr>
-        <w:pStyle w:val="Normal"/>
-        <w:rPr/>
-      </w:pPr>
-      <w:r>
-        <w:rPr/>
-      </w:r>
-      <w:r>
-        <w:br w:type="page"/>
-      </w:r>
-    </w:p>
-    <w:p>
-      <w:pPr>
-        <w:pStyle w:val="Normal"/>
-        <w:spacing w:before="0" w:after="0"/>
-        <w:rPr>
-          <w:b/>
-          <w:bCs/>
-          <w:u w:val="single"/>
-        </w:rPr>
-      </w:pPr>
-      <w:r>
-        <w:rPr>
           <w:rStyle w:val="Strong"/>
           <w:b/>
           <w:bCs/>
@@ -998,6 +1070,61 @@
       <w:r>
         <w:rPr/>
         <w:t xml:space="preserve"> Developed a lightweight BDD-based framework for automated functional and performance checks in production, executing every 10 minutes to validate critical user journeys. Captured backend service metrics during each run, enabling early detection of latency or degradation before customer impact. Defined synthetic SLAs, budgets and integrated alerting to proactively flag anomalies in backend components</w:t>
+      </w:r>
+    </w:p>
+    <w:p>
+      <w:pPr>
+        <w:pStyle w:val="Normal"/>
+        <w:suppressLineNumbers w:val="0"/>
+        <w:bidi w:val="0"/>
+        <w:spacing w:lineRule="auto" w:line="259" w:before="280" w:after="160"/>
+        <w:ind w:start="0" w:end="0"/>
+        <w:jc w:val="start"/>
+        <w:rPr/>
+      </w:pPr>
+      <w:r>
+        <w:rPr/>
+        <w:t xml:space="preserve">• </w:t>
+      </w:r>
+      <w:r>
+        <w:rPr>
+          <w:rStyle w:val="Strong"/>
+        </w:rPr>
+        <w:t xml:space="preserve"> </w:t>
+      </w:r>
+      <w:r>
+        <w:rPr>
+          <w:rStyle w:val="Strong"/>
+        </w:rPr>
+        <w:t>SLI Definition &amp; Reliability Reporting:</w:t>
+      </w:r>
+      <w:r>
+        <w:rPr/>
+        <w:t xml:space="preserve"> Defined internal Service Level Indicators (SLIs) for platform services </w:t>
+      </w:r>
+      <w:r>
+        <w:rPr/>
+        <w:t>using</w:t>
+      </w:r>
+      <w:r>
+        <w:rPr/>
+        <w:t xml:space="preserve"> Splunk </w:t>
+      </w:r>
+      <w:r>
+        <w:rPr/>
+        <w:t>for</w:t>
+      </w:r>
+      <w:r>
+        <w:rPr/>
+        <w:t xml:space="preserve"> </w:t>
+      </w:r>
+      <w:r>
+        <w:rPr/>
+        <w:t>analysis, dashboarding, and alarming,</w:t>
+      </w:r>
+      <w:r>
+        <w:rPr/>
+        <w:t xml:space="preserve"> giving engineering teams a shared, data-driven view of reliability and early-warning signals</w:t>
       </w:r>
     </w:p>
     <w:p>
@@ -1083,7 +1210,7 @@
           <w:bCs/>
           <w:u w:val="single"/>
         </w:rPr>
-        <w:t xml:space="preserve">Lead QA Automation Engineer - Welltok | </w:t>
+        <w:t xml:space="preserve">Site Reliability Engineer - Welltok | </w:t>
       </w:r>
       <w:r>
         <w:rPr>
@@ -1259,11 +1386,51 @@
           <w:b/>
           <w:bCs/>
         </w:rPr>
-        <w:t>SLI &amp; SLA Instrumentation:</w:t>
-      </w:r>
-      <w:r>
-        <w:rPr/>
-        <w:t xml:space="preserve"> Created actionable Service Level Indicators (SLIs), alarm thresholds, and Splunk dashboards to track SLA compliance, budgets and operational health</w:t>
+        <w:t xml:space="preserve">SLI, </w:t>
+      </w:r>
+      <w:r>
+        <w:rPr>
+          <w:b/>
+          <w:bCs/>
+        </w:rPr>
+        <w:t xml:space="preserve">SLO &amp; </w:t>
+      </w:r>
+      <w:r>
+        <w:rPr>
+          <w:b/>
+          <w:bCs/>
+        </w:rPr>
+        <w:t xml:space="preserve">SLA </w:t>
+      </w:r>
+      <w:r>
+        <w:rPr>
+          <w:b/>
+          <w:bCs/>
+        </w:rPr>
+        <w:t>creation</w:t>
+      </w:r>
+      <w:r>
+        <w:rPr>
+          <w:b/>
+          <w:bCs/>
+        </w:rPr>
+        <w:t>:</w:t>
+      </w:r>
+      <w:r>
+        <w:rPr/>
+        <w:t xml:space="preserve"> Defined Service Level Indicators, </w:t>
+      </w:r>
+      <w:r>
+        <w:rPr/>
+        <w:t>Objectives</w:t>
+      </w:r>
+      <w:r>
+        <w:rPr/>
+        <w:t xml:space="preserve"> and </w:t>
+      </w:r>
+      <w:r>
+        <w:rPr/>
+        <w:t>Agreement tracking, reporting and alarming for compliance, internal engineering teams and external customer SLA reporting support</w:t>
       </w:r>
     </w:p>
     <w:p>
@@ -2440,9 +2607,10 @@
       </w:r>
     </w:p>
     <w:sectPr>
+      <w:headerReference w:type="default" r:id="rId5"/>
       <w:type w:val="nextPage"/>
       <w:pgSz w:w="12240" w:h="15840"/>
-      <w:pgMar w:left="1080" w:right="1080" w:gutter="0" w:header="0" w:top="1080" w:footer="0" w:bottom="1080"/>
+      <w:pgMar w:left="1080" w:right="1080" w:gutter="0" w:header="1080" w:top="1639" w:footer="0" w:bottom="1080"/>
       <w:pgNumType w:fmt="decimal"/>
       <w:formProt w:val="false"/>
       <w:textDirection w:val="lrTb"/>
@@ -2450,6 +2618,20 @@
     </w:sectPr>
   </w:body>
 </w:document>
+</file>
+
+<file path=word/header1.xml><?xml version="1.0" encoding="utf-8"?>
+<w:hdr xmlns:o="urn:schemas-microsoft-com:office:office" xmlns:r="http://schemas.openxmlformats.org/officeDocument/2006/relationships" xmlns:v="urn:schemas-microsoft-com:vml" xmlns:w="http://schemas.openxmlformats.org/wordprocessingml/2006/main" xmlns:w10="urn:schemas-microsoft-com:office:word" xmlns:wp="http://schemas.openxmlformats.org/drawingml/2006/wordprocessingDrawing" xmlns:pic="http://schemas.openxmlformats.org/drawingml/2006/picture" xmlns:wps="http://schemas.microsoft.com/office/word/2010/wordprocessingShape" xmlns:wpg="http://schemas.microsoft.com/office/word/2010/wordprocessingGroup" xmlns:mc="http://schemas.openxmlformats.org/markup-compatibility/2006" xmlns:wp14="http://schemas.microsoft.com/office/word/2010/wordprocessingDrawing" xmlns:w14="http://schemas.microsoft.com/office/word/2010/wordml" xmlns:w15="http://schemas.microsoft.com/office/word/2012/wordml" mc:Ignorable="w14 wp14 w15">
+  <w:p>
+    <w:pPr>
+      <w:pStyle w:val="Header"/>
+      <w:rPr/>
+    </w:pPr>
+    <w:r>
+      <w:rPr/>
+    </w:r>
+  </w:p>
+</w:hdr>
 </file>
 
 <file path=word/styles.xml><?xml version="1.0" encoding="utf-8"?>
@@ -3034,6 +3216,28 @@
     <w:qFormat/>
     <w:pPr>
       <w:spacing w:before="280" w:after="280"/>
+    </w:pPr>
+    <w:rPr/>
+  </w:style>
+  <w:style w:type="paragraph" w:styleId="HeaderandFooter">
+    <w:name w:val="Header and Footer"/>
+    <w:basedOn w:val="Normal"/>
+    <w:qFormat/>
+    <w:pPr>
+      <w:suppressLineNumbers/>
+      <w:tabs>
+        <w:tab w:val="clear" w:pos="720"/>
+        <w:tab w:val="center" w:pos="5040" w:leader="none"/>
+        <w:tab w:val="right" w:pos="10080" w:leader="none"/>
+      </w:tabs>
+    </w:pPr>
+    <w:rPr/>
+  </w:style>
+  <w:style w:type="paragraph" w:styleId="Header">
+    <w:name w:val="header"/>
+    <w:basedOn w:val="HeaderandFooter"/>
+    <w:pPr>
+      <w:suppressLineNumbers/>
     </w:pPr>
     <w:rPr/>
   </w:style>

</xml_diff>

<commit_message>
Update Centene departure month to September 2026
- resume.md + experience.astro: end date Aug 2026 -> Sep 2026
- public/stephen-abbot-resume.{docx,pdf}: replaced with revised source files

Co-Authored-By: Claude Opus 4.8 <noreply@anthropic.com>
</commit_message>
<xml_diff>
--- a/public/stephen-abbot-resume.docx
+++ b/public/stephen-abbot-resume.docx
@@ -226,9 +226,17 @@
         <w:rPr>
           <w:b/>
           <w:bCs/>
+          <w:u w:val="single"/>
+        </w:rPr>
+        <w:t>September</w:t>
+      </w:r>
+      <w:r>
+        <w:rPr>
+          <w:b/>
+          <w:bCs/>
           <w:u w:val="none"/>
         </w:rPr>
-        <w:t>August 2026</w:t>
+        <w:t xml:space="preserve"> 2026</w:t>
       </w:r>
     </w:p>
     <w:p>
@@ -239,23 +247,7 @@
       </w:pPr>
       <w:r>
         <w:rPr/>
-        <w:t>Led Cloud Enablement efforts to improve AWS governance, compliance, and observability for Engineering teams managing 40+ AWS accounts, as part of a broader onboarding initiative spanning 800+ accounts organization-wide. Partner</w:t>
-      </w:r>
-      <w:r>
-        <w:rPr/>
-        <w:t>ed</w:t>
-      </w:r>
-      <w:r>
-        <w:rPr/>
-        <w:t xml:space="preserve"> with engineering teams and stakeholders to build scalable automation tools for onboarding, alarm standardization, and sensitive data detection. Architected a reusable Python/PostgreSQL-based platform that empower</w:t>
-      </w:r>
-      <w:r>
-        <w:rPr/>
-        <w:t>ed</w:t>
-      </w:r>
-      <w:r>
-        <w:rPr/>
-        <w:t xml:space="preserve"> teams to identify resource waste, security gaps, and operational drift.</w:t>
+        <w:t>Led Cloud Enablement efforts to improve AWS governance, compliance, and observability for Engineering teams managing 40+ AWS accounts, as part of a broader onboarding initiative spanning 800+ accounts organization-wide. Partnered with engineering teams and stakeholders to build scalable automation tools for onboarding, alarm standardization, and sensitive data detection. Architected a reusable Python/PostgreSQL-based platform that empowered teams to identify resource waste, security gaps, and operational drift.</w:t>
       </w:r>
     </w:p>
     <w:p>
@@ -273,29 +265,11 @@
           <w:b/>
           <w:bCs/>
         </w:rPr>
-        <w:t>Automate</w:t>
-      </w:r>
-      <w:r>
-        <w:rPr>
-          <w:b/>
-          <w:bCs/>
-        </w:rPr>
-        <w:t>d</w:t>
-      </w:r>
-      <w:r>
-        <w:rPr>
-          <w:b/>
-          <w:bCs/>
-        </w:rPr>
-        <w:t xml:space="preserve"> CloudWatch Alarming management</w:t>
-      </w:r>
-      <w:r>
-        <w:rPr/>
-        <w:t xml:space="preserve">: </w:t>
-      </w:r>
-      <w:r>
-        <w:rPr/>
-        <w:t xml:space="preserve"> Designed, implemented, and extended an in-house Terraform-based alarming solution delivering minimum-recommended and custom CloudWatch alarms across Customer accounts — establishing a reusable, governance-aligned alerting foundation at scale</w:t>
+        <w:t>Automated CloudWatch Alarming management</w:t>
+      </w:r>
+      <w:r>
+        <w:rPr/>
+        <w:t>:  Designed, implemented, and extended an in-house Terraform-based alarming solution delivering minimum-recommended and custom CloudWatch alarms across Customer accounts — establishing a reusable, governance-aligned alerting foundation at scale</w:t>
       </w:r>
     </w:p>
     <w:p>
@@ -317,11 +291,7 @@
       </w:r>
       <w:r>
         <w:rPr/>
-        <w:t xml:space="preserve">:  </w:t>
-      </w:r>
-      <w:r>
-        <w:rPr/>
-        <w:t xml:space="preserve">S3 and CloudWatch: Applied AWS Macie for S3 bucket sensitive data scanning; engineered a complementary CloudWatch log analysis tool using keyword pattern matching and taxonomy-based classification to extend detection to log groups - a surface Macie did not cover at the time </w:t>
+        <w:t xml:space="preserve">:  S3 and CloudWatch: Applied AWS Macie for S3 bucket sensitive data scanning; engineered a complementary CloudWatch log analysis tool using keyword pattern matching and taxonomy-based classification to extend detection to log groups - a surface Macie did not cover at the time </w:t>
       </w:r>
     </w:p>
     <w:p>
@@ -351,41 +321,41 @@
     <w:p>
       <w:pPr>
         <w:pStyle w:val="Normal"/>
+        <w:spacing w:before="0" w:after="160"/>
+        <w:rPr>
+          <w:b/>
+          <w:bCs/>
+          <w:u w:val="single"/>
+        </w:rPr>
+      </w:pPr>
+      <w:r>
+        <w:rPr>
+          <w:b/>
+          <w:bCs/>
+          <w:u w:val="single"/>
+        </w:rPr>
+        <w:t>Sr. Site Reliability Engineer - Centene (Contractor via Zeektek) | Remote | Dec 2023 - Aug 2024</w:t>
+      </w:r>
+    </w:p>
+    <w:p>
+      <w:pPr>
+        <w:pStyle w:val="Normal"/>
+        <w:suppressLineNumbers w:val="0"/>
+        <w:bidi w:val="0"/>
+        <w:spacing w:lineRule="auto" w:line="259" w:before="280" w:after="160"/>
+        <w:ind w:start="0" w:end="0"/>
+        <w:jc w:val="start"/>
+        <w:rPr/>
+      </w:pPr>
+      <w:r>
+        <w:rPr/>
+        <w:t>Enabled consistent deployment of AWS Recommended and custom alarms to support reliable, actionable monitoring across environments. Standardized alerting made it easier for teams to detect issues early, reduce configuration drift, and maintain consistent cross team scalable monitoring practices.</w:t>
+      </w:r>
+    </w:p>
+    <w:p>
+      <w:pPr>
+        <w:pStyle w:val="Normal"/>
         <w:spacing w:before="280" w:after="160"/>
-        <w:rPr>
-          <w:b/>
-          <w:bCs/>
-          <w:u w:val="single"/>
-        </w:rPr>
-      </w:pPr>
-      <w:r>
-        <w:rPr>
-          <w:b/>
-          <w:bCs/>
-          <w:u w:val="single"/>
-        </w:rPr>
-        <w:t>Sr. Site Reliability Engineer - Centene (Contractor via Zeektek) | Remote | Dec 2023 - Aug 2024</w:t>
-      </w:r>
-    </w:p>
-    <w:p>
-      <w:pPr>
-        <w:pStyle w:val="Normal"/>
-        <w:suppressLineNumbers w:val="0"/>
-        <w:bidi w:val="0"/>
-        <w:spacing w:lineRule="auto" w:line="259" w:before="280" w:after="160"/>
-        <w:ind w:start="0" w:end="0"/>
-        <w:jc w:val="start"/>
-        <w:rPr/>
-      </w:pPr>
-      <w:r>
-        <w:rPr/>
-        <w:t>Enabled consistent deployment of AWS Recommended and custom alarms to support reliable, actionable monitoring across environments. Standardized alerting made it easier for teams to detect issues early, reduce configuration drift, and maintain consistent cross team scalable monitoring practices.</w:t>
-      </w:r>
-    </w:p>
-    <w:p>
-      <w:pPr>
-        <w:pStyle w:val="Normal"/>
-        <w:spacing w:before="280" w:after="160"/>
         <w:rPr/>
       </w:pPr>
       <w:r>
@@ -401,31 +371,7 @@
       </w:r>
       <w:r>
         <w:rPr/>
-        <w:t xml:space="preserve">: </w:t>
-      </w:r>
-      <w:r>
-        <w:rPr/>
-        <w:t>Designed and b</w:t>
-      </w:r>
-      <w:r>
-        <w:rPr/>
-        <w:t xml:space="preserve">uilt a modular Python reconnaissance tool - aggregating Config, Trusted Advisor, Cost Explorer, Security Hub, Macie, IAM, and service-level APIs - to establish ground-truth account visibility before each team onboarding engagement; surfaced alarming candidates alongside governance findings (tag non-compliance, CW log encryption and retention gaps, cost anomalies, sensitive data exposure) that teams had been unaware of </w:t>
-      </w:r>
-      <w:r>
-        <w:rPr/>
-        <w:t xml:space="preserve">in (often </w:t>
-      </w:r>
-      <w:r>
-        <w:rPr/>
-        <w:t>inherited</w:t>
-      </w:r>
-      <w:r>
-        <w:rPr/>
-        <w:t>)</w:t>
-      </w:r>
-      <w:r>
-        <w:rPr/>
-        <w:t xml:space="preserve"> accounts; extensible by design - each additional discovery capability was added incrementally as a new API module</w:t>
+        <w:t>: Designed and built a modular Python reconnaissance tool - aggregating Config, Trusted Advisor, Cost Explorer, Security Hub, Macie, IAM, and service-level APIs - to establish ground-truth account visibility before each team onboarding engagement; surfaced alarming candidates alongside governance findings (tag non-compliance, CW log encryption and retention gaps, cost anomalies, sensitive data exposure) that teams had been unaware of in (often inherited) accounts; extensible by design - each additional discovery capability was added incrementally as a new API module</w:t>
       </w:r>
     </w:p>
     <w:p>
@@ -1326,7 +1272,6 @@
       <w:pPr>
         <w:pStyle w:val="Normal"/>
         <w:suppressLineNumbers w:val="0"/>
-        <w:pBdr/>
         <w:bidi w:val="0"/>
         <w:spacing w:lineRule="auto" w:line="259" w:before="280" w:after="160"/>
         <w:ind w:start="0" w:end="0"/>
@@ -1356,7 +1301,6 @@
       <w:pPr>
         <w:pStyle w:val="Normal"/>
         <w:suppressLineNumbers w:val="0"/>
-        <w:pBdr/>
         <w:bidi w:val="0"/>
         <w:spacing w:lineRule="auto" w:line="259" w:before="280" w:after="160"/>
         <w:ind w:start="0" w:end="0"/>
@@ -1503,7 +1447,6 @@
       <w:pPr>
         <w:pStyle w:val="Normal"/>
         <w:suppressLineNumbers w:val="0"/>
-        <w:pBdr/>
         <w:bidi w:val="0"/>
         <w:spacing w:lineRule="auto" w:line="259" w:before="280" w:after="160"/>
         <w:ind w:start="0" w:end="0"/>
@@ -1587,7 +1530,6 @@
       <w:pPr>
         <w:pStyle w:val="Normal"/>
         <w:suppressLineNumbers w:val="0"/>
-        <w:pBdr/>
         <w:bidi w:val="0"/>
         <w:spacing w:lineRule="auto" w:line="259" w:before="280" w:after="160"/>
         <w:ind w:start="0" w:end="0"/>
@@ -1672,7 +1614,6 @@
       <w:pPr>
         <w:pStyle w:val="Normal"/>
         <w:suppressLineNumbers w:val="0"/>
-        <w:pBdr/>
         <w:bidi w:val="0"/>
         <w:spacing w:lineRule="auto" w:line="259" w:before="280" w:after="160"/>
         <w:ind w:start="0" w:end="0"/>
@@ -1765,7 +1706,6 @@
       <w:pPr>
         <w:pStyle w:val="Normal"/>
         <w:suppressLineNumbers w:val="0"/>
-        <w:pBdr/>
         <w:bidi w:val="0"/>
         <w:spacing w:lineRule="auto" w:line="259" w:before="280" w:after="160"/>
         <w:ind w:start="0" w:end="0"/>
@@ -1785,7 +1725,6 @@
       <w:pPr>
         <w:pStyle w:val="Normal"/>
         <w:suppressLineNumbers w:val="0"/>
-        <w:pBdr/>
         <w:bidi w:val="0"/>
         <w:spacing w:lineRule="auto" w:line="259" w:before="280" w:after="160"/>
         <w:ind w:start="0" w:end="0"/>
@@ -1816,9 +1755,8 @@
       <w:pPr>
         <w:pStyle w:val="Normal"/>
         <w:suppressLineNumbers w:val="0"/>
-        <w:pBdr/>
-        <w:bidi w:val="0"/>
-        <w:spacing w:lineRule="auto" w:line="259" w:before="280" w:after="160"/>
+        <w:bidi w:val="0"/>
+        <w:spacing w:lineRule="auto" w:line="259" w:before="0" w:after="160"/>
         <w:ind w:start="0" w:end="0"/>
         <w:jc w:val="start"/>
         <w:rPr/>
@@ -2123,7 +2061,6 @@
       <w:pPr>
         <w:pStyle w:val="Normal"/>
         <w:suppressLineNumbers w:val="0"/>
-        <w:pBdr/>
         <w:bidi w:val="0"/>
         <w:spacing w:lineRule="auto" w:line="259" w:before="280" w:after="160"/>
         <w:ind w:start="0" w:end="0"/>
@@ -2169,7 +2106,7 @@
     <w:p>
       <w:pPr>
         <w:pStyle w:val="Normal"/>
-        <w:spacing w:before="240" w:after="240"/>
+        <w:spacing w:before="0" w:after="240"/>
         <w:rPr>
           <w:rFonts w:eastAsia="Times New Roman" w:cs="Times New Roman"/>
           <w:b/>
@@ -2215,7 +2152,25 @@
           <w:szCs w:val="24"/>
           <w:lang w:val="en-US"/>
         </w:rPr>
-        <w:t xml:space="preserve"> AWS (Trusted Advisor, Security Hub, Macie, </w:t>
+        <w:t xml:space="preserve"> AWS (Trusted Advisor, Security Hub, Macie, CloudTrail, SDK, IAM, Config, Identity Center, Cost Explorer, API Gateway, SNS, SQS, EventBridge, Firehose, EKS, EC2, Lambda, RDS, EBS, ECS, VPC, VPCE, S3, CloudWatch, LB, Transit Gateway, Secrets Manager, SSM Parameter store)</w:t>
+      </w:r>
+    </w:p>
+    <w:p>
+      <w:pPr>
+        <w:pStyle w:val="Normal"/>
+        <w:spacing w:before="240" w:after="240"/>
+        <w:rPr/>
+      </w:pPr>
+      <w:r>
+        <w:rPr>
+          <w:rFonts w:eastAsia="Times New Roman" w:cs="Times New Roman"/>
+          <w:b/>
+          <w:bCs/>
+          <w:sz w:val="24"/>
+          <w:szCs w:val="24"/>
+          <w:lang w:val="en-US"/>
+        </w:rPr>
+        <w:t>Infrastructure &amp; Automation:</w:t>
       </w:r>
       <w:r>
         <w:rPr>
@@ -2224,7 +2179,25 @@
           <w:szCs w:val="24"/>
           <w:lang w:val="en-US"/>
         </w:rPr>
-        <w:t>C</w:t>
+        <w:t xml:space="preserve"> Terraform, CloudFormation, Git, CI/CD, GitHub Actions, Bash</w:t>
+      </w:r>
+    </w:p>
+    <w:p>
+      <w:pPr>
+        <w:pStyle w:val="Normal"/>
+        <w:spacing w:before="240" w:after="240"/>
+        <w:rPr/>
+      </w:pPr>
+      <w:r>
+        <w:rPr>
+          <w:rFonts w:eastAsia="Times New Roman" w:cs="Times New Roman"/>
+          <w:b/>
+          <w:bCs/>
+          <w:sz w:val="24"/>
+          <w:szCs w:val="24"/>
+          <w:lang w:val="en-US"/>
+        </w:rPr>
+        <w:t>Databases:</w:t>
       </w:r>
       <w:r>
         <w:rPr>
@@ -2233,7 +2206,25 @@
           <w:szCs w:val="24"/>
           <w:lang w:val="en-US"/>
         </w:rPr>
-        <w:t>loud</w:t>
+        <w:t xml:space="preserve"> Postgres, MySQL, SQL Server, DynamoDB</w:t>
+      </w:r>
+    </w:p>
+    <w:p>
+      <w:pPr>
+        <w:pStyle w:val="Normal"/>
+        <w:spacing w:before="240" w:after="240"/>
+        <w:rPr/>
+      </w:pPr>
+      <w:r>
+        <w:rPr>
+          <w:rFonts w:eastAsia="Times New Roman" w:cs="Times New Roman"/>
+          <w:b/>
+          <w:bCs/>
+          <w:sz w:val="24"/>
+          <w:szCs w:val="24"/>
+          <w:lang w:val="en-US"/>
+        </w:rPr>
+        <w:t>Observability &amp; Monitoring:</w:t>
       </w:r>
       <w:r>
         <w:rPr>
@@ -2242,7 +2233,25 @@
           <w:szCs w:val="24"/>
           <w:lang w:val="en-US"/>
         </w:rPr>
-        <w:t>T</w:t>
+        <w:t xml:space="preserve"> CloudWatch, Splunk, Dynatrace, New Relic, RUM, custom alerting frameworks</w:t>
+      </w:r>
+    </w:p>
+    <w:p>
+      <w:pPr>
+        <w:pStyle w:val="Normal"/>
+        <w:spacing w:before="240" w:after="240"/>
+        <w:rPr/>
+      </w:pPr>
+      <w:r>
+        <w:rPr>
+          <w:rFonts w:eastAsia="Times New Roman" w:cs="Times New Roman"/>
+          <w:b/>
+          <w:bCs/>
+          <w:sz w:val="24"/>
+          <w:szCs w:val="24"/>
+          <w:lang w:val="en-US"/>
+        </w:rPr>
+        <w:t>Languages &amp; SDKs:</w:t>
       </w:r>
       <w:r>
         <w:rPr>
@@ -2251,7 +2260,25 @@
           <w:szCs w:val="24"/>
           <w:lang w:val="en-US"/>
         </w:rPr>
-        <w:t xml:space="preserve">rail, </w:t>
+        <w:t xml:space="preserve"> Python (Boto3, AWS SDK), Java, Node, .NET, SQL</w:t>
+      </w:r>
+    </w:p>
+    <w:p>
+      <w:pPr>
+        <w:pStyle w:val="Normal"/>
+        <w:spacing w:before="240" w:after="240"/>
+        <w:rPr/>
+      </w:pPr>
+      <w:r>
+        <w:rPr>
+          <w:rFonts w:eastAsia="Times New Roman" w:cs="Times New Roman"/>
+          <w:b/>
+          <w:bCs/>
+          <w:sz w:val="24"/>
+          <w:szCs w:val="24"/>
+          <w:lang w:val="en-US"/>
+        </w:rPr>
+        <w:t>Containers &amp; Orchestration:</w:t>
       </w:r>
       <w:r>
         <w:rPr>
@@ -2260,178 +2287,7 @@
           <w:szCs w:val="24"/>
           <w:lang w:val="en-US"/>
         </w:rPr>
-        <w:t xml:space="preserve">SDK, IAM, Config, Identity Center, Cost Explorer, API Gateway, SNS, SQS, EventBridge, Firehose, EKS, EC2, </w:t>
-      </w:r>
-      <w:r>
-        <w:rPr>
-          <w:rFonts w:eastAsia="Times New Roman" w:cs="Times New Roman"/>
-          <w:sz w:val="24"/>
-          <w:szCs w:val="24"/>
-          <w:lang w:val="en-US"/>
-        </w:rPr>
-        <w:t>L</w:t>
-      </w:r>
-      <w:r>
-        <w:rPr>
-          <w:rFonts w:eastAsia="Times New Roman" w:cs="Times New Roman"/>
-          <w:sz w:val="24"/>
-          <w:szCs w:val="24"/>
-          <w:lang w:val="en-US"/>
-        </w:rPr>
-        <w:t>ambda, RDS, EBS, ECS, VPC, VPCE, S3, CloudWatch, LB, Transit Gateway, Secrets Manager, SSM Parameter store)</w:t>
-      </w:r>
-    </w:p>
-    <w:p>
-      <w:pPr>
-        <w:pStyle w:val="Normal"/>
-        <w:spacing w:before="240" w:after="240"/>
-        <w:rPr/>
-      </w:pPr>
-      <w:r>
-        <w:rPr>
-          <w:rFonts w:eastAsia="Times New Roman" w:cs="Times New Roman"/>
-          <w:b/>
-          <w:bCs/>
-          <w:sz w:val="24"/>
-          <w:szCs w:val="24"/>
-          <w:lang w:val="en-US"/>
-        </w:rPr>
-        <w:t>Infrastructure &amp; Automation:</w:t>
-      </w:r>
-      <w:r>
-        <w:rPr>
-          <w:rFonts w:eastAsia="Times New Roman" w:cs="Times New Roman"/>
-          <w:sz w:val="24"/>
-          <w:szCs w:val="24"/>
-          <w:lang w:val="en-US"/>
-        </w:rPr>
-        <w:t xml:space="preserve"> Terraform, CloudFormation, Git, CI/CD, GitHub Actions, Bash</w:t>
-      </w:r>
-    </w:p>
-    <w:p>
-      <w:pPr>
-        <w:pStyle w:val="Normal"/>
-        <w:spacing w:before="240" w:after="240"/>
-        <w:rPr/>
-      </w:pPr>
-      <w:r>
-        <w:rPr>
-          <w:rFonts w:eastAsia="Times New Roman" w:cs="Times New Roman"/>
-          <w:b/>
-          <w:bCs/>
-          <w:sz w:val="24"/>
-          <w:szCs w:val="24"/>
-          <w:lang w:val="en-US"/>
-        </w:rPr>
-        <w:t>Databases:</w:t>
-      </w:r>
-      <w:r>
-        <w:rPr>
-          <w:rFonts w:eastAsia="Times New Roman" w:cs="Times New Roman"/>
-          <w:sz w:val="24"/>
-          <w:szCs w:val="24"/>
-          <w:lang w:val="en-US"/>
-        </w:rPr>
-        <w:t xml:space="preserve"> Postgres, MySQL, SQL Server, DynamoDB</w:t>
-      </w:r>
-    </w:p>
-    <w:p>
-      <w:pPr>
-        <w:pStyle w:val="Normal"/>
-        <w:spacing w:before="240" w:after="240"/>
-        <w:rPr/>
-      </w:pPr>
-      <w:r>
-        <w:rPr>
-          <w:rFonts w:eastAsia="Times New Roman" w:cs="Times New Roman"/>
-          <w:b/>
-          <w:bCs/>
-          <w:sz w:val="24"/>
-          <w:szCs w:val="24"/>
-          <w:lang w:val="en-US"/>
-        </w:rPr>
-        <w:t>Observability &amp; Monitoring:</w:t>
-      </w:r>
-      <w:r>
-        <w:rPr>
-          <w:rFonts w:eastAsia="Times New Roman" w:cs="Times New Roman"/>
-          <w:sz w:val="24"/>
-          <w:szCs w:val="24"/>
-          <w:lang w:val="en-US"/>
-        </w:rPr>
-        <w:t xml:space="preserve"> CloudWatch, Splunk, Dynatrace, New Relic, RUM, custom alerting frameworks</w:t>
-      </w:r>
-    </w:p>
-    <w:p>
-      <w:pPr>
-        <w:pStyle w:val="Normal"/>
-        <w:spacing w:before="240" w:after="240"/>
-        <w:rPr/>
-      </w:pPr>
-      <w:r>
-        <w:rPr>
-          <w:rFonts w:eastAsia="Times New Roman" w:cs="Times New Roman"/>
-          <w:b/>
-          <w:bCs/>
-          <w:sz w:val="24"/>
-          <w:szCs w:val="24"/>
-          <w:lang w:val="en-US"/>
-        </w:rPr>
-        <w:t>Languages &amp; SDKs:</w:t>
-      </w:r>
-      <w:r>
-        <w:rPr>
-          <w:rFonts w:eastAsia="Times New Roman" w:cs="Times New Roman"/>
-          <w:sz w:val="24"/>
-          <w:szCs w:val="24"/>
-          <w:lang w:val="en-US"/>
-        </w:rPr>
-        <w:t xml:space="preserve"> Python (Boto3, AWS SDK), Java, Node, .NET, SQL</w:t>
-      </w:r>
-    </w:p>
-    <w:p>
-      <w:pPr>
-        <w:pStyle w:val="Normal"/>
-        <w:spacing w:before="240" w:after="240"/>
-        <w:rPr/>
-      </w:pPr>
-      <w:r>
-        <w:rPr>
-          <w:rFonts w:eastAsia="Times New Roman" w:cs="Times New Roman"/>
-          <w:b/>
-          <w:bCs/>
-          <w:sz w:val="24"/>
-          <w:szCs w:val="24"/>
-          <w:lang w:val="en-US"/>
-        </w:rPr>
-        <w:t>Containers &amp; Orchestration:</w:t>
-      </w:r>
-      <w:r>
-        <w:rPr>
-          <w:rFonts w:eastAsia="Times New Roman" w:cs="Times New Roman"/>
-          <w:sz w:val="24"/>
-          <w:szCs w:val="24"/>
-          <w:lang w:val="en-US"/>
-        </w:rPr>
-        <w:t xml:space="preserve"> </w:t>
-      </w:r>
-      <w:r>
-        <w:rPr>
-          <w:rFonts w:eastAsia="Times New Roman" w:cs="Times New Roman"/>
-          <w:sz w:val="24"/>
-          <w:szCs w:val="24"/>
-          <w:lang w:val="en-US"/>
-        </w:rPr>
-        <w:t xml:space="preserve">ECS, EKS, </w:t>
-      </w:r>
-      <w:r>
-        <w:rPr>
-          <w:rFonts w:eastAsia="Times New Roman" w:cs="Times New Roman"/>
-          <w:sz w:val="24"/>
-          <w:szCs w:val="24"/>
-          <w:lang w:val="en-US"/>
-        </w:rPr>
-        <w:t>Podman, Docker</w:t>
+        <w:t xml:space="preserve"> ECS, EKS, Podman, Docker</w:t>
       </w:r>
     </w:p>
     <w:sectPr>
@@ -2516,7 +2372,7 @@
     <w:pPr>
       <w:widowControl/>
       <w:suppressAutoHyphens w:val="true"/>
-      <w:overflowPunct w:val="false"/>
+      <w:overflowPunct w:val="true"/>
       <w:bidi w:val="0"/>
       <w:spacing w:before="0" w:after="0"/>
       <w:jc w:val="start"/>

</xml_diff>